<commit_message>
Update topic application with new order, appointment and seminar flows
</commit_message>
<xml_diff>
--- a/Stronghold_Prijava_Seminarski_RS2_v3.docx
+++ b/Stronghold_Prijava_Seminarski_RS2_v3.docx
@@ -1045,7 +1045,7 @@
         <w:t xml:space="preserve"> </w:t>
       </w:r>
       <w:r>
-        <w:t xml:space="preserve">vremena odabranog trenera ili nutricioniste.</w:t>
+        <w:t xml:space="preserve">vremena odabranog trenera ili nutricioniste. Za potvrđeni termin koji je prošao administrator evidentira nedolazak člana, a termine koje niko ne zatvori sistem automatski zatvara narednog dana.</w:t>
       </w:r>
     </w:p>
     <w:p>
@@ -1124,7 +1124,7 @@
         <w:t xml:space="preserve"> </w:t>
       </w:r>
       <w:r>
-        <w:t xml:space="preserve">pregleda stavke i iznos, označava narudžbu kao dostavljenu ili je otkazuje. Kupac o svakoj promjeni</w:t>
+        <w:t xml:space="preserve">pregleda stavke i iznos, označava narudžbu kao poslanu pa dostavljenu, a po potrebi je otkazuje. Kupac o svakoj promjeni</w:t>
       </w:r>
       <w:r>
         <w:t xml:space="preserve"> </w:t>
@@ -1136,7 +1136,7 @@
         <w:t xml:space="preserve"> </w:t>
       </w:r>
       <w:r>
-        <w:t xml:space="preserve">novca kupcu.</w:t>
+        <w:t xml:space="preserve">novca kupcu. Kupac i sam može otkazati narudžbu dok je još u obradi.</w:t>
       </w:r>
     </w:p>
     <w:p>
@@ -1312,7 +1312,7 @@
         <w:t xml:space="preserve"> </w:t>
       </w:r>
       <w:r>
-        <w:t xml:space="preserve">potrebi mijenja ili briše.</w:t>
+        <w:t xml:space="preserve">potrebi mijenja, briše ili otkazuje - pri otkazivanju svi prijavljeni automatski dobijaju obavijest u aplikaciji i e-mail sa razlogom.</w:t>
       </w:r>
     </w:p>
     <w:p>
@@ -1967,7 +1967,7 @@
         <w:t xml:space="preserve"> </w:t>
       </w:r>
       <w:r>
-        <w:t xml:space="preserve">ekranu. Da bi korisnik napravio termin kod trenera/nutricioniste, korisnik mora da ima aktivnu</w:t>
+        <w:t xml:space="preserve">ekranu, najkasnije dva sata prije početka. Da bi korisnik napravio termin kod trenera/nutricioniste, korisnik mora da ima aktivnu</w:t>
       </w:r>
       <w:r>
         <w:t xml:space="preserve"> </w:t>
@@ -2052,13 +2052,13 @@
         <w:t xml:space="preserve"> </w:t>
       </w:r>
       <w:r>
-        <w:t xml:space="preserve">prijavljuje se jednim klikom dok ima mjesta. Notifikacije obavještavaju o uspješnom plaćanju,</w:t>
-      </w:r>
-      <w:r>
-        <w:t xml:space="preserve"> </w:t>
-      </w:r>
-      <w:r>
-        <w:t xml:space="preserve">promjeni statusa narudžbe, potvrdi termina, skorom isteku članarine i nadolazećim seminarima.</w:t>
+        <w:t xml:space="preserve">prijavljuje se jednim klikom dok ima mjesta, a do početka seminara se može i odjaviti. Notifikacije obavještavaju o uspješnom plaćanju,</w:t>
+      </w:r>
+      <w:r>
+        <w:t xml:space="preserve"> </w:t>
+      </w:r>
+      <w:r>
+        <w:t xml:space="preserve">promjeni statusa narudžbe, potvrdi termina, podsjetnicima na sutrašnje termine i nadolazeće seminare, skorom isteku ili ukidanju članarine i otkazu seminara.</w:t>
       </w:r>
       <w:r>
         <w:t xml:space="preserve"> </w:t>
@@ -2362,7 +2362,7 @@
         <w:t xml:space="preserve"> </w:t>
       </w:r>
       <w:r>
-        <w:t xml:space="preserve">termina, podsjetnici o isteku članarine) ne izvršava se u sklopu samog zahtjeva, nego se poruka</w:t>
+        <w:t xml:space="preserve">termina, podsjetnici o isteku članarine, sutrašnjim terminima i seminarima, obavijesti o otkazu seminara) ne izvršava se u sklopu samog zahtjeva, nego se poruka</w:t>
       </w:r>
       <w:r>
         <w:t xml:space="preserve"> </w:t>

</xml_diff>

<commit_message>
Update topic application documents
</commit_message>
<xml_diff>
--- a/Stronghold_Prijava_Seminarski_RS2_v3.docx
+++ b/Stronghold_Prijava_Seminarski_RS2_v3.docx
@@ -760,25 +760,7 @@
         <w:pStyle w:val="FirstParagraph"/>
       </w:pPr>
       <w:r>
-        <w:t xml:space="preserve">Izvještajni modul kroz tri taba pokriva prihode, stanje inventara i članarine. Prihodi se</w:t>
-      </w:r>
-      <w:r>
-        <w:t xml:space="preserve"> </w:t>
-      </w:r>
-      <w:r>
-        <w:t xml:space="preserve">prikazuju po mjesecima uz listu najprodavanijih proizvoda, inventar upozorava na proizvode koji se</w:t>
-      </w:r>
-      <w:r>
-        <w:t xml:space="preserve"> </w:t>
-      </w:r>
-      <w:r>
-        <w:t xml:space="preserve">slabo prodaju ili ih nema na zalihama, a tab članarina pokazuje najpopularnije pakete i</w:t>
-      </w:r>
-      <w:r>
-        <w:t xml:space="preserve"> </w:t>
-      </w:r>
-      <w:r>
-        <w:t xml:space="preserve">posjećenost. Svaki tab se može preuzeti kao PDF ili Excel dokument.</w:t>
+        <w:t xml:space="preserve">Izvještajni modul kroz tri taba pokriva prihode, stanje inventara i članarine. Tab prihoda prikazuje mjesečne prihode razdvojene na članarine i prodavnicu, prosječnu vrijednost narudžbe i stopu otkaza, uz najprodavanije proizvode i prihod po kategorijama. Inventar uz stanje i vrijednost zaliha procjenjuje za koliko dana artikal nestaje sa zaliha po tekućem tempu prodaje te izdvaja artikle bez prodaje i najlošije ocijenjene proizvode. Tab članarina prati stopu obnove članarina, pakete, špic sate i prosječno trajanje posjete. Svaki tab se može preuzeti kao PDF ili Excel dokument.</w:t>
       </w:r>
     </w:p>
     <w:p>
@@ -1045,7 +1027,7 @@
         <w:t xml:space="preserve"> </w:t>
       </w:r>
       <w:r>
-        <w:t xml:space="preserve">vremena odabranog trenera ili nutricioniste. Za potvrđeni termin koji je prošao administrator evidentira nedolazak člana, a termine koje niko ne zatvori sistem automatski zatvara narednog dana.</w:t>
+        <w:t xml:space="preserve">vremena odabranog trenera ili nutricioniste. Termine koje niko ne zatvori sistem automatski zatvara narednog dana.</w:t>
       </w:r>
     </w:p>
     <w:p>
@@ -1124,19 +1106,7 @@
         <w:t xml:space="preserve"> </w:t>
       </w:r>
       <w:r>
-        <w:t xml:space="preserve">pregleda stavke i iznos, označava narudžbu kao poslanu pa dostavljenu, a po potrebi je otkazuje. Kupac o svakoj promjeni</w:t>
-      </w:r>
-      <w:r>
-        <w:t xml:space="preserve"> </w:t>
-      </w:r>
-      <w:r>
-        <w:t xml:space="preserve">statusa dobija obavijest u aplikaciji i na e-mail, a otkazivanje plaćene narudžbe uključuje povrat</w:t>
-      </w:r>
-      <w:r>
-        <w:t xml:space="preserve"> </w:t>
-      </w:r>
-      <w:r>
-        <w:t xml:space="preserve">novca kupcu. Kupac i sam može otkazati narudžbu dok je još u obradi.</w:t>
+        <w:t xml:space="preserve">pregleda stavke i iznos, označava narudžbu kao poslanu pa dostavljenu, a po potrebi je otkazuje - otkazivanje plaćene narudžbe uključuje povrat novca kupcu. Kupac o svakoj promjeni statusa dobija obavijest u aplikaciji, a o slanju i otkazivanju i e-mail.</w:t>
       </w:r>
     </w:p>
     <w:p>
@@ -2058,7 +2028,7 @@
         <w:t xml:space="preserve"> </w:t>
       </w:r>
       <w:r>
-        <w:t xml:space="preserve">promjeni statusa narudžbe, potvrdi termina, podsjetnicima na sutrašnje termine i nadolazeće seminare, skorom isteku ili ukidanju članarine i otkazu seminara.</w:t>
+        <w:t xml:space="preserve">promjeni statusa narudžbe, potvrdi ili otkazu termina, podsjetnicima na sutrašnje termine i nadolazeće seminare, skorom isteku ili ukidanju članarine i otkazu seminara.</w:t>
       </w:r>
       <w:r>
         <w:t xml:space="preserve"> </w:t>

</xml_diff>